<commit_message>
Add validation, gold match review queue, sources; update docs and pipeline scripts
- Add api/validation.py, dbt_project gold match review queue + sources.yml
- Add scripts/build_pipeline.py and generate_matches.py
- Update API, dbt gold models, docs, and frontend
- Remove stray Office lock file
</commit_message>
<xml_diff>
--- a/Design_Document.docx
+++ b/Design_Document.docx
@@ -124,7 +124,7 @@
         <w:spacing w:after="160"/>
       </w:pPr>
       <w:r>
-        <w:t xml:space="preserve">This document describes the design of the MDM Medallion Architecture Demo: a working master data management (MDM) platform built to demonstrate the core disciplines of enterprise data governance — metadata-driven data quality, deterministic match/merge and survivorship, AI-assisted data stewardship, lineage and impact analysis, and access-controlled data products.</w:t>
+        <w:t xml:space="preserve">This document describes the design of the MDM Medallion Architecture Demo: a working master data management (MDM) platform built to demonstrate the core disciplines of enterprise data governance — metadata-driven data quality, hybrid deterministic + embedding-similarity match/merge and survivorship, AI-assisted data stewardship, lineage and impact analysis, and access-controlled data products.</w:t>
       </w:r>
     </w:p>
     <w:p>
@@ -187,7 +187,7 @@
         <w:spacing w:after="90"/>
       </w:pPr>
       <w:r>
-        <w:t xml:space="preserve">Deterministic match/merge and survivorship logic, including the real-time reprocessing path.</w:t>
+        <w:t xml:space="preserve">Hybrid deterministic + embedding-similarity match/merge and survivorship logic, the Match Review workflow for borderline fuzzy matches, and the real-time reprocessing path.</w:t>
       </w:r>
     </w:p>
     <w:p>
@@ -1138,7 +1138,7 @@
                 <w:sz w:val="19"/>
                 <w:szCs w:val="19"/>
               </w:rPr>
-              <w:t xml:space="preserve">     v  (deterministic match: email OR phone)  v  (Data Stewardship Console</w:t>
+              <w:t xml:space="preserve">     v  (hybrid match: exact email/phone +   v  (Data Stewardship Console</w:t>
             </w:r>
           </w:p>
           <w:p>
@@ -1151,7 +1151,7 @@
                 <w:sz w:val="19"/>
                 <w:szCs w:val="19"/>
               </w:rPr>
-              <w:t xml:space="preserve">  [ GOLD ]  gold_customers + gold_crosswalk        + AI-assisted remediation)</w:t>
+              <w:t xml:space="preserve">     fuzzy embedding similarity)              + AI-assisted remediation)</w:t>
             </w:r>
           </w:p>
           <w:p>
@@ -1164,7 +1164,7 @@
                 <w:sz w:val="19"/>
                 <w:szCs w:val="19"/>
               </w:rPr>
-              <w:t xml:space="preserve">     |                                        |</w:t>
+              <w:t xml:space="preserve">  [ GOLD ]  gold_customers + gold_crosswalk</w:t>
             </w:r>
           </w:p>
           <w:p>
@@ -1177,7 +1177,46 @@
                 <w:sz w:val="19"/>
                 <w:szCs w:val="19"/>
               </w:rPr>
+              <w:t xml:space="preserve">     + gold_match_review_queue (borderline fuzzy matches)</w:t>
+            </w:r>
+          </w:p>
+          <w:p>
+            <w:pPr>
+              <w:spacing w:after="20"/>
+            </w:pPr>
+            <w:r>
+              <w:rPr>
+                <w:rFonts w:ascii="Consolas" w:cs="Consolas" w:eastAsia="Consolas" w:hAnsi="Consolas"/>
+                <w:sz w:val="19"/>
+                <w:szCs w:val="19"/>
+              </w:rPr>
+              <w:t xml:space="preserve">     |                                        |</w:t>
+            </w:r>
+          </w:p>
+          <w:p>
+            <w:pPr>
+              <w:spacing w:after="20"/>
+            </w:pPr>
+            <w:r>
+              <w:rPr>
+                <w:rFonts w:ascii="Consolas" w:cs="Consolas" w:eastAsia="Consolas" w:hAnsi="Consolas"/>
+                <w:sz w:val="19"/>
+                <w:szCs w:val="19"/>
+              </w:rPr>
               <w:t xml:space="preserve">     |            &lt;---- real-time reprocessing on steward approval ----</w:t>
+            </w:r>
+          </w:p>
+          <w:p>
+            <w:pPr>
+              <w:spacing w:after="20"/>
+            </w:pPr>
+            <w:r>
+              <w:rPr>
+                <w:rFonts w:ascii="Consolas" w:cs="Consolas" w:eastAsia="Consolas" w:hAnsi="Consolas"/>
+                <w:sz w:val="19"/>
+                <w:szCs w:val="19"/>
+              </w:rPr>
+              <w:t xml:space="preserve">     |            &lt;---- Match Review confirm/reject feeds the next batch match run ----</w:t>
             </w:r>
           </w:p>
           <w:p>
@@ -1419,7 +1458,7 @@
                 <w:sz w:val="18"/>
                 <w:szCs w:val="18"/>
               </w:rPr>
-              <w:t xml:space="preserve">load_bronze.py, create_admin_user.py, reset_admin_password.py</w:t>
+              <w:t xml:space="preserve">load_bronze.py, generate_matches.py (fuzzy match/merge), build_pipeline.py, create_admin_user.py, reset_admin_password.py</w:t>
             </w:r>
           </w:p>
         </w:tc>
@@ -2750,7 +2789,7 @@
         <w:spacing w:after="160"/>
       </w:pPr>
       <w:r>
-        <w:t xml:space="preserve">Two silver records are considered the same customer if they share a normalized email (lowercased, trimmed) or a normalized phone (digits only). A dense_rank() window function over the coalesced match key assigns each record a match_group_id, effectively performing a union-find over shared keys. This is intentionally deterministic and exact-match only, to keep the survivorship and crosswalk logic easy to follow and verify.</w:t>
+        <w:t xml:space="preserve">Two silver records are considered the same customer through a hybrid, two-tier strategy computed by scripts/generate_matches.py, a Python step that runs between silver and gold (dbt-duckdb cannot do embedding math in SQL, so this is a deliberate departure from the otherwise all-dbt pipeline — see Section 2.2). Tier 1 is deterministic: two records match if they share a normalized email (lowercased, trimmed) or a normalized phone (digits only), confidence 1.00. Tier 2 is an embedding-similarity fuzzy match: each record’s name and address fields are combined into a short text blob and vectorized with a TF-IDF character n-gram encoder (scikit-learn), candidate pairs are generated via blocking on state_code (to avoid an O(n²) comparison at scale), and cosine similarity is computed within each block. Pairs scoring at or above a calibrated high threshold auto-merge with their similarity score as the match confidence; pairs in a lower borderline band are not auto-merged — they are written to gold_match_review_queue for a data steward to confirm or reject (Section 4.1). All tier-1 edges, auto-merged tier-2 edges, and any steward-confirmed tier-2 edges feed a single graph, clustered via union-find (path compression + union by rank) to assign each record a match_group_id. A steward’s confirm/reject decision (stewardship.match_review_overrides) is honored the next time generate_matches.py runs — confirmed pairs are forced into the same cluster, rejected pairs are permanently excluded from ever resurfacing.</w:t>
       </w:r>
     </w:p>
     <w:p>
@@ -2782,7 +2821,7 @@
         <w:spacing w:after="160"/>
       </w:pPr>
       <w:r>
-        <w:t xml:space="preserve">Every source record that contributed to a golden record has a row here: golden_id, source_system, source_record_id, a match_confidence_score (1.00 if corroborated by a second source, 0.50 if the golden record is single-source/provisional), and an is_survivor_record flag identifying which contributing row was the survivor. This is the mechanism that answers “which source records make up this golden record, and how confident are we in the match?”</w:t>
+        <w:t xml:space="preserve">Every source record that contributed to a golden record has a row here: golden_id, source_system, source_record_id, a match_confidence_score, and an is_survivor_record flag identifying which contributing row was the survivor. The confidence score is genuinely graduated: 1.00 for a tier-1 exact match, the actual cosine similarity score (typically 0.80–1.00) for a tier-2 fuzzy auto-merge or steward-confirmed match, and 0.50 (“provisional”) for a single-source record with no corroborating match at all. This is the mechanism that answers “which source records make up this golden record, and how confident are we in the match?”</w:t>
       </w:r>
     </w:p>
     <w:p>
@@ -2827,7 +2866,7 @@
           <w:iCs/>
           <w:color w:val="5B6770"/>
         </w:rPr>
-        <w:t xml:space="preserve">Design note: because this graph is statically seeded rather than derived from live pipeline execution metadata, it can silently drift from what the pipeline actually does if a new column or transformation is added without a corresponding edge — this already happened once during development with wildcard match-key nodes, and was fixed in edges E018/E019.</w:t>
+        <w:t xml:space="preserve">Design note: because this graph is statically seeded rather than derived from live pipeline execution metadata, it can silently drift from what the pipeline actually does if a new column or transformation is added without a corresponding edge — this has happened twice during development with wildcard match-key nodes — first fixed in edges E018/E019, then again when the match/merge step moved into a new gold_prep schema (fixed in edges E013/E014/E018–E026). Re-verify with /api/v1/lineage/impact and /trace after touching lineage_edges.csv rather than eyeballing it.</w:t>
       </w:r>
     </w:p>
     <w:p>
@@ -2856,7 +2895,7 @@
         <w:spacing w:after="160"/>
       </w:pPr>
       <w:r>
-        <w:t xml:space="preserve">A single-page console for working the exception queue. It lists open exceptions (source system, record ID, name, and reject reasons), and lets a steward select a record, edit any field inline, optionally request an AI-assisted remediation suggestion, and either approve (resolve) or reject the record.</w:t>
+        <w:t xml:space="preserve">A two-tab console. The Exception Queue tab lists open exceptions (source system, record ID, name, and reject reasons), and lets a steward select a record, edit any field inline, optionally request an AI-assisted remediation suggestion, and either approve (resolve) or reject the record.</w:t>
       </w:r>
     </w:p>
     <w:p>
@@ -2865,6 +2904,14 @@
       </w:pPr>
       <w:r>
         <w:t xml:space="preserve">Approving a correction triggers real-time reprocessing (see Section 5) rather than waiting for the next batch dbt run — the corrected record is immediately upserted into silver, matched against the current gold set, and survivorship is recomputed. The console surfaces the outcome (new golden record created vs. an existing one updated) directly in a toast notification.</w:t>
+      </w:r>
+    </w:p>
+    <w:p>
+      <w:pPr>
+        <w:spacing w:after="160"/>
+      </w:pPr>
+      <w:r>
+        <w:t xml:space="preserve">The Match Review tab shows borderline fuzzy-match candidates from the gold layer’s embedding-similarity tier (similarity between the review and auto-merge thresholds), side by side, for the steward to confirm (“same customer, merge them”) or reject (“coincidence, keep separate”). Unlike exception resolution, this does not reprocess in real time — re-clustering is a global union-find recompute, not a local update — so the decision takes effect on the next full pipeline rebuild (scripts/generate_matches.py followed by dbt run --select gold.*).</w:t>
       </w:r>
     </w:p>
     <w:p>
@@ -2990,7 +3037,7 @@
         <w:spacing w:after="90"/>
       </w:pPr>
       <w:r>
-        <w:t xml:space="preserve">Match against the current gold set — the corrected record's normalized email/phone is compared against each existing golden record's current survivor values (not every historical non-survivor source in that group), using the same deterministic match strategy as the batch pipeline.</w:t>
+        <w:t xml:space="preserve">Match against the current gold set — the corrected record's normalized email/phone is compared against each existing golden record's current survivor values (not every historical non-survivor source in that group), using the same deterministic tier-1 exact match strategy as the batch pipeline — the fuzzy embedding-similarity tier only runs in the batch pipeline’s scripts/generate_matches.py, not in this real-time path (see Section 9).</w:t>
       </w:r>
     </w:p>
     <w:p>
@@ -5573,6 +5620,372 @@
                 <w:sz w:val="18"/>
                 <w:szCs w:val="18"/>
               </w:rPr>
+              <w:t xml:space="preserve">GET /stewardship/match-review?status=pending</w:t>
+            </w:r>
+          </w:p>
+        </w:tc>
+        <w:tc>
+          <w:tcPr>
+            <w:tcW w:type="dxa" w:w="4360"/>
+            <w:tcBorders>
+              <w:top w:val="single" w:color="CCCCCC" w:sz="2"/>
+              <w:left w:val="single" w:color="CCCCCC" w:sz="2"/>
+              <w:bottom w:val="single" w:color="CCCCCC" w:sz="2"/>
+              <w:right w:val="single" w:color="CCCCCC" w:sz="2"/>
+            </w:tcBorders>
+            <w:tcMar>
+              <w:top w:type="dxa" w:w="80"/>
+              <w:left w:type="dxa" w:w="110"/>
+              <w:bottom w:type="dxa" w:w="80"/>
+              <w:right w:type="dxa" w:w="110"/>
+            </w:tcMar>
+            <w:vAlign w:val="center"/>
+          </w:tcPr>
+          <w:p>
+            <w:r>
+              <w:rPr>
+                <w:b w:val="false"/>
+                <w:bCs w:val="false"/>
+                <w:sz w:val="18"/>
+                <w:szCs w:val="18"/>
+              </w:rPr>
+              <w:t xml:space="preserve">Borderline fuzzy-match candidates</w:t>
+            </w:r>
+          </w:p>
+        </w:tc>
+        <w:tc>
+          <w:tcPr>
+            <w:tcW w:type="dxa" w:w="1400"/>
+            <w:tcBorders>
+              <w:top w:val="single" w:color="CCCCCC" w:sz="2"/>
+              <w:left w:val="single" w:color="CCCCCC" w:sz="2"/>
+              <w:bottom w:val="single" w:color="CCCCCC" w:sz="2"/>
+              <w:right w:val="single" w:color="CCCCCC" w:sz="2"/>
+            </w:tcBorders>
+            <w:tcMar>
+              <w:top w:type="dxa" w:w="80"/>
+              <w:left w:type="dxa" w:w="110"/>
+              <w:bottom w:type="dxa" w:w="80"/>
+              <w:right w:type="dxa" w:w="110"/>
+            </w:tcMar>
+            <w:vAlign w:val="center"/>
+          </w:tcPr>
+          <w:p>
+            <w:r>
+              <w:rPr>
+                <w:b w:val="false"/>
+                <w:bCs w:val="false"/>
+                <w:sz w:val="18"/>
+                <w:szCs w:val="18"/>
+              </w:rPr>
+              <w:t xml:space="preserve">Steward/Owner</w:t>
+            </w:r>
+          </w:p>
+        </w:tc>
+      </w:tr>
+      <w:tr>
+        <w:tc>
+          <w:tcPr>
+            <w:tcW w:type="dxa" w:w="3600"/>
+            <w:tcBorders>
+              <w:top w:val="single" w:color="CCCCCC" w:sz="2"/>
+              <w:left w:val="single" w:color="CCCCCC" w:sz="2"/>
+              <w:bottom w:val="single" w:color="CCCCCC" w:sz="2"/>
+              <w:right w:val="single" w:color="CCCCCC" w:sz="2"/>
+            </w:tcBorders>
+            <w:shd w:fill="DCEAF0" w:val="clear"/>
+            <w:tcMar>
+              <w:top w:type="dxa" w:w="80"/>
+              <w:left w:type="dxa" w:w="110"/>
+              <w:bottom w:type="dxa" w:w="80"/>
+              <w:right w:type="dxa" w:w="110"/>
+            </w:tcMar>
+            <w:vAlign w:val="center"/>
+          </w:tcPr>
+          <w:p>
+            <w:r>
+              <w:rPr>
+                <w:rFonts w:ascii="Consolas" w:cs="Consolas" w:eastAsia="Consolas" w:hAnsi="Consolas"/>
+                <w:b w:val="false"/>
+                <w:bCs w:val="false"/>
+                <w:sz w:val="18"/>
+                <w:szCs w:val="18"/>
+              </w:rPr>
+              <w:t xml:space="preserve">GET /stewardship/match-review/{pair_id}</w:t>
+            </w:r>
+          </w:p>
+        </w:tc>
+        <w:tc>
+          <w:tcPr>
+            <w:tcW w:type="dxa" w:w="4360"/>
+            <w:tcBorders>
+              <w:top w:val="single" w:color="CCCCCC" w:sz="2"/>
+              <w:left w:val="single" w:color="CCCCCC" w:sz="2"/>
+              <w:bottom w:val="single" w:color="CCCCCC" w:sz="2"/>
+              <w:right w:val="single" w:color="CCCCCC" w:sz="2"/>
+            </w:tcBorders>
+            <w:shd w:fill="DCEAF0" w:val="clear"/>
+            <w:tcMar>
+              <w:top w:type="dxa" w:w="80"/>
+              <w:left w:type="dxa" w:w="110"/>
+              <w:bottom w:type="dxa" w:w="80"/>
+              <w:right w:type="dxa" w:w="110"/>
+            </w:tcMar>
+            <w:vAlign w:val="center"/>
+          </w:tcPr>
+          <w:p>
+            <w:r>
+              <w:rPr>
+                <w:b w:val="false"/>
+                <w:bCs w:val="false"/>
+                <w:sz w:val="18"/>
+                <w:szCs w:val="18"/>
+              </w:rPr>
+              <w:t xml:space="preserve">One match-review candidate, full detail</w:t>
+            </w:r>
+          </w:p>
+        </w:tc>
+        <w:tc>
+          <w:tcPr>
+            <w:tcW w:type="dxa" w:w="1400"/>
+            <w:tcBorders>
+              <w:top w:val="single" w:color="CCCCCC" w:sz="2"/>
+              <w:left w:val="single" w:color="CCCCCC" w:sz="2"/>
+              <w:bottom w:val="single" w:color="CCCCCC" w:sz="2"/>
+              <w:right w:val="single" w:color="CCCCCC" w:sz="2"/>
+            </w:tcBorders>
+            <w:shd w:fill="DCEAF0" w:val="clear"/>
+            <w:tcMar>
+              <w:top w:type="dxa" w:w="80"/>
+              <w:left w:type="dxa" w:w="110"/>
+              <w:bottom w:type="dxa" w:w="80"/>
+              <w:right w:type="dxa" w:w="110"/>
+            </w:tcMar>
+            <w:vAlign w:val="center"/>
+          </w:tcPr>
+          <w:p>
+            <w:r>
+              <w:rPr>
+                <w:b w:val="false"/>
+                <w:bCs w:val="false"/>
+                <w:sz w:val="18"/>
+                <w:szCs w:val="18"/>
+              </w:rPr>
+              <w:t xml:space="preserve">Steward/Owner</w:t>
+            </w:r>
+          </w:p>
+        </w:tc>
+      </w:tr>
+      <w:tr>
+        <w:tc>
+          <w:tcPr>
+            <w:tcW w:type="dxa" w:w="3600"/>
+            <w:tcBorders>
+              <w:top w:val="single" w:color="CCCCCC" w:sz="2"/>
+              <w:left w:val="single" w:color="CCCCCC" w:sz="2"/>
+              <w:bottom w:val="single" w:color="CCCCCC" w:sz="2"/>
+              <w:right w:val="single" w:color="CCCCCC" w:sz="2"/>
+            </w:tcBorders>
+            <w:tcMar>
+              <w:top w:type="dxa" w:w="80"/>
+              <w:left w:type="dxa" w:w="110"/>
+              <w:bottom w:type="dxa" w:w="80"/>
+              <w:right w:type="dxa" w:w="110"/>
+            </w:tcMar>
+            <w:vAlign w:val="center"/>
+          </w:tcPr>
+          <w:p>
+            <w:r>
+              <w:rPr>
+                <w:rFonts w:ascii="Consolas" w:cs="Consolas" w:eastAsia="Consolas" w:hAnsi="Consolas"/>
+                <w:b w:val="false"/>
+                <w:bCs w:val="false"/>
+                <w:sz w:val="18"/>
+                <w:szCs w:val="18"/>
+              </w:rPr>
+              <w:t xml:space="preserve">POST /stewardship/match-review/{pair_id}/confirm</w:t>
+            </w:r>
+          </w:p>
+        </w:tc>
+        <w:tc>
+          <w:tcPr>
+            <w:tcW w:type="dxa" w:w="4360"/>
+            <w:tcBorders>
+              <w:top w:val="single" w:color="CCCCCC" w:sz="2"/>
+              <w:left w:val="single" w:color="CCCCCC" w:sz="2"/>
+              <w:bottom w:val="single" w:color="CCCCCC" w:sz="2"/>
+              <w:right w:val="single" w:color="CCCCCC" w:sz="2"/>
+            </w:tcBorders>
+            <w:tcMar>
+              <w:top w:type="dxa" w:w="80"/>
+              <w:left w:type="dxa" w:w="110"/>
+              <w:bottom w:type="dxa" w:w="80"/>
+              <w:right w:type="dxa" w:w="110"/>
+            </w:tcMar>
+            <w:vAlign w:val="center"/>
+          </w:tcPr>
+          <w:p>
+            <w:r>
+              <w:rPr>
+                <w:b w:val="false"/>
+                <w:bCs w:val="false"/>
+                <w:sz w:val="18"/>
+                <w:szCs w:val="18"/>
+              </w:rPr>
+              <w:t xml:space="preserve">Confirm a pair is the same customer</w:t>
+            </w:r>
+          </w:p>
+        </w:tc>
+        <w:tc>
+          <w:tcPr>
+            <w:tcW w:type="dxa" w:w="1400"/>
+            <w:tcBorders>
+              <w:top w:val="single" w:color="CCCCCC" w:sz="2"/>
+              <w:left w:val="single" w:color="CCCCCC" w:sz="2"/>
+              <w:bottom w:val="single" w:color="CCCCCC" w:sz="2"/>
+              <w:right w:val="single" w:color="CCCCCC" w:sz="2"/>
+            </w:tcBorders>
+            <w:tcMar>
+              <w:top w:type="dxa" w:w="80"/>
+              <w:left w:type="dxa" w:w="110"/>
+              <w:bottom w:type="dxa" w:w="80"/>
+              <w:right w:type="dxa" w:w="110"/>
+            </w:tcMar>
+            <w:vAlign w:val="center"/>
+          </w:tcPr>
+          <w:p>
+            <w:r>
+              <w:rPr>
+                <w:b w:val="false"/>
+                <w:bCs w:val="false"/>
+                <w:sz w:val="18"/>
+                <w:szCs w:val="18"/>
+              </w:rPr>
+              <w:t xml:space="preserve">Steward/Owner</w:t>
+            </w:r>
+          </w:p>
+        </w:tc>
+      </w:tr>
+      <w:tr>
+        <w:tc>
+          <w:tcPr>
+            <w:tcW w:type="dxa" w:w="3600"/>
+            <w:tcBorders>
+              <w:top w:val="single" w:color="CCCCCC" w:sz="2"/>
+              <w:left w:val="single" w:color="CCCCCC" w:sz="2"/>
+              <w:bottom w:val="single" w:color="CCCCCC" w:sz="2"/>
+              <w:right w:val="single" w:color="CCCCCC" w:sz="2"/>
+            </w:tcBorders>
+            <w:shd w:fill="DCEAF0" w:val="clear"/>
+            <w:tcMar>
+              <w:top w:type="dxa" w:w="80"/>
+              <w:left w:type="dxa" w:w="110"/>
+              <w:bottom w:type="dxa" w:w="80"/>
+              <w:right w:type="dxa" w:w="110"/>
+            </w:tcMar>
+            <w:vAlign w:val="center"/>
+          </w:tcPr>
+          <w:p>
+            <w:r>
+              <w:rPr>
+                <w:rFonts w:ascii="Consolas" w:cs="Consolas" w:eastAsia="Consolas" w:hAnsi="Consolas"/>
+                <w:b w:val="false"/>
+                <w:bCs w:val="false"/>
+                <w:sz w:val="18"/>
+                <w:szCs w:val="18"/>
+              </w:rPr>
+              <w:t xml:space="preserve">POST /stewardship/match-review/{pair_id}/reject</w:t>
+            </w:r>
+          </w:p>
+        </w:tc>
+        <w:tc>
+          <w:tcPr>
+            <w:tcW w:type="dxa" w:w="4360"/>
+            <w:tcBorders>
+              <w:top w:val="single" w:color="CCCCCC" w:sz="2"/>
+              <w:left w:val="single" w:color="CCCCCC" w:sz="2"/>
+              <w:bottom w:val="single" w:color="CCCCCC" w:sz="2"/>
+              <w:right w:val="single" w:color="CCCCCC" w:sz="2"/>
+            </w:tcBorders>
+            <w:shd w:fill="DCEAF0" w:val="clear"/>
+            <w:tcMar>
+              <w:top w:type="dxa" w:w="80"/>
+              <w:left w:type="dxa" w:w="110"/>
+              <w:bottom w:type="dxa" w:w="80"/>
+              <w:right w:type="dxa" w:w="110"/>
+            </w:tcMar>
+            <w:vAlign w:val="center"/>
+          </w:tcPr>
+          <w:p>
+            <w:r>
+              <w:rPr>
+                <w:b w:val="false"/>
+                <w:bCs w:val="false"/>
+                <w:sz w:val="18"/>
+                <w:szCs w:val="18"/>
+              </w:rPr>
+              <w:t xml:space="preserve">Reject a pair as coincidental</w:t>
+            </w:r>
+          </w:p>
+        </w:tc>
+        <w:tc>
+          <w:tcPr>
+            <w:tcW w:type="dxa" w:w="1400"/>
+            <w:tcBorders>
+              <w:top w:val="single" w:color="CCCCCC" w:sz="2"/>
+              <w:left w:val="single" w:color="CCCCCC" w:sz="2"/>
+              <w:bottom w:val="single" w:color="CCCCCC" w:sz="2"/>
+              <w:right w:val="single" w:color="CCCCCC" w:sz="2"/>
+            </w:tcBorders>
+            <w:shd w:fill="DCEAF0" w:val="clear"/>
+            <w:tcMar>
+              <w:top w:type="dxa" w:w="80"/>
+              <w:left w:type="dxa" w:w="110"/>
+              <w:bottom w:type="dxa" w:w="80"/>
+              <w:right w:type="dxa" w:w="110"/>
+            </w:tcMar>
+            <w:vAlign w:val="center"/>
+          </w:tcPr>
+          <w:p>
+            <w:r>
+              <w:rPr>
+                <w:b w:val="false"/>
+                <w:bCs w:val="false"/>
+                <w:sz w:val="18"/>
+                <w:szCs w:val="18"/>
+              </w:rPr>
+              <w:t xml:space="preserve">Steward/Owner</w:t>
+            </w:r>
+          </w:p>
+        </w:tc>
+      </w:tr>
+      <w:tr>
+        <w:tc>
+          <w:tcPr>
+            <w:tcW w:type="dxa" w:w="3600"/>
+            <w:tcBorders>
+              <w:top w:val="single" w:color="CCCCCC" w:sz="2"/>
+              <w:left w:val="single" w:color="CCCCCC" w:sz="2"/>
+              <w:bottom w:val="single" w:color="CCCCCC" w:sz="2"/>
+              <w:right w:val="single" w:color="CCCCCC" w:sz="2"/>
+            </w:tcBorders>
+            <w:tcMar>
+              <w:top w:type="dxa" w:w="80"/>
+              <w:left w:type="dxa" w:w="110"/>
+              <w:bottom w:type="dxa" w:w="80"/>
+              <w:right w:type="dxa" w:w="110"/>
+            </w:tcMar>
+            <w:vAlign w:val="center"/>
+          </w:tcPr>
+          <w:p>
+            <w:r>
+              <w:rPr>
+                <w:rFonts w:ascii="Consolas" w:cs="Consolas" w:eastAsia="Consolas" w:hAnsi="Consolas"/>
+                <w:b w:val="false"/>
+                <w:bCs w:val="false"/>
+                <w:sz w:val="18"/>
+                <w:szCs w:val="18"/>
+              </w:rPr>
               <w:t xml:space="preserve">GET /admin/users</w:t>
             </w:r>
           </w:p>
@@ -6013,7 +6426,7 @@
           <w:iCs/>
           <w:color w:val="5B6770"/>
         </w:rPr>
-        <w:t xml:space="preserve">Note: the stewardship queue endpoints require a Bearer token and enforce the dataSteward/dataOwner role check described in Section 7.2; the Data Stewardship Console shares its session with the login-gated portal via a common browser-side session token (Section 4.1).</w:t>
+        <w:t xml:space="preserve">Note: the stewardship queue and match-review endpoints require a Bearer token and enforce the dataSteward/dataOwner role check described in Section 7.2; the Data Stewardship Console shares its session with the login-gated portal via a common browser-side session token (Section 4.1).</w:t>
       </w:r>
     </w:p>
     <w:p>
@@ -6047,7 +6460,7 @@
         <w:spacing w:after="90"/>
       </w:pPr>
       <w:r>
-        <w:t xml:space="preserve">Matching is deterministic (exact match on normalized email or phone), not fuzzy/probabilistic.</w:t>
+        <w:t xml:space="preserve">Matching is hybrid: deterministic exact-match (tier 1) plus a lightweight TF-IDF embedding-similarity fuzzy tier (tier 2), not a full probabilistic/ML matching model — no phonetic algorithms, no configurable per-field match weights, no learned confidence model.</w:t>
       </w:r>
     </w:p>
     <w:p>
@@ -6060,7 +6473,7 @@
         <w:spacing w:after="90"/>
       </w:pPr>
       <w:r>
-        <w:t xml:space="preserve">Survivorship is record-level (whole record from one winning source), not attribute-level.</w:t>
+        <w:t xml:space="preserve">The fuzzy tier’s thresholds (auto-merge and review-band cutoffs) were calibrated empirically against this project’s synthetic data generator’s seeded fuzzy-duplicate pairs versus every same-block non-duplicate pair, not derived analytically — re-calibrate if the generator’s population changes materially.</w:t>
       </w:r>
     </w:p>
     <w:p>
@@ -6073,7 +6486,7 @@
         <w:spacing w:after="90"/>
       </w:pPr>
       <w:r>
-        <w:t xml:space="preserve">Steward corrections skip re-validation against the metadata rules — steward approval is treated as authoritative.</w:t>
+        <w:t xml:space="preserve">Survivorship is record-level (whole record from one winning source), not attribute-level.</w:t>
       </w:r>
     </w:p>
     <w:p>
@@ -6086,7 +6499,20 @@
         <w:spacing w:after="90"/>
       </w:pPr>
       <w:r>
-        <w:t xml:space="preserve">Real-time reprocessing's match step compares against each golden record's current survivor values, not every historical non-survivor source in that group.</w:t>
+        <w:t xml:space="preserve">Steward corrections skip re-validation against the metadata rules — steward approval is treated as authoritative.</w:t>
+      </w:r>
+    </w:p>
+    <w:p>
+      <w:pPr>
+        <w:pStyle w:val="ListParagraph"/>
+        <w:numPr>
+          <w:ilvl w:val="0"/>
+          <w:numId w:val="2"/>
+        </w:numPr>
+        <w:spacing w:after="90"/>
+      </w:pPr>
+      <w:r>
+        <w:t xml:space="preserve">Real-time reprocessing’s match step compares against each golden record’s current survivor values, not every historical non-survivor source in that group — and only runs the tier-1 exact match, never the tier-2 fuzzy embedding tier (fitting a TF-IDF vectorizer per API request was judged not worth the added request latency for a demo-scoped feature). A confirmed/rejected Match Review decision similarly only takes effect on the next batch pipeline rebuild, not instantly.</w:t>
       </w:r>
     </w:p>
     <w:p>

</xml_diff>

<commit_message>
Document audit trail feature in docx deliverables
- Design_Document.docx: new Section 3.6 (Gold-Layer Audit Trail
  architecture, three write paths, snapshot-diff mechanism, access
  control, known limitations), a Scope bullet, an Audit Trail bullet
  under the Portal's feature list (4.2), a new API Reference table row,
  and a Known Design Simplifications bullet.
- Enterprise_Readiness_Assessment.docx: Update (July 2026) notes on the
  two gap-analysis bullets this feature partially closes (steward
  correction audit trail; who-edited vs. who-viewed logging), following
  the doc's existing update-annotation pattern.
- Installation_Guide_Linux.docx / Installation_Guide_Windows.docx:
  build_pipeline.py now runs five stages, not four (the new audit diff
  step).
</commit_message>
<xml_diff>
--- a/Design_Document.docx
+++ b/Design_Document.docx
@@ -240,6 +240,19 @@
       </w:pPr>
       <w:r>
         <w:t xml:space="preserve">Known design simplifications and the rationale behind each.</w:t>
+      </w:r>
+    </w:p>
+    <w:p>
+      <w:pPr>
+        <w:pStyle w:val="ListParagraph"/>
+        <w:numPr>
+          <w:ilvl w:val="0"/>
+          <w:numId w:val="2"/>
+        </w:numPr>
+        <w:spacing w:after="90"/>
+      </w:pPr>
+      <w:r>
+        <w:t xml:space="preserve">The gold-layer audit trail: architecture, capture points, and access controls (Section 3.6).</w:t>
       </w:r>
     </w:p>
     <w:p>
@@ -2870,6 +2883,51 @@
       </w:r>
     </w:p>
     <w:p>
+      <w:pPr>
+        <w:pStyle w:val="Heading2"/>
+      </w:pPr>
+      <w:r>
+        <w:t xml:space="preserve">3.6 Gold-Layer Audit Trail</w:t>
+      </w:r>
+    </w:p>
+    <w:p>
+      <w:pPr>
+        <w:spacing w:after="160"/>
+      </w:pPr>
+      <w:r>
+        <w:t xml:space="preserve">audit.audit_trail is an append-only table (api/audit.py) recording every golden record’s creation, edit, and logical delete. Rows are grouped by a change_batch_id so a single logical operation that touches several fields appears as one history entry with per-field old/new values, rather than one row per operation. No code path anywhere issues an UPDATE or DELETE against this table — that omission is the enforcement mechanism, consistent with this project’s app-level-only security model (Section 7).</w:t>
+      </w:r>
+    </w:p>
+    <w:p>
+      <w:pPr>
+        <w:spacing w:after="160"/>
+      </w:pPr>
+      <w:r>
+        <w:t xml:space="preserve">Three writers feed it, one for each way a golden record can change. api/main.py’s update_customer() endpoint logs a portal_manual_edit batch when a user with read_write gold access saves an inline edit. api/reprocessing.py logs a steward_reprocessing batch for both outcomes of real-time reprocessing (Section 5) — a brand-new golden record, or a survivorship recompute on an existing one. And scripts/audit_pipeline_diff.py, run as the final stage of the batch pipeline build (Section 2.2), logs a pipeline_batch batch by diffing each freshly rebuilt gold_customers table against audit.gold_customers_snapshot — a copy of gold_customers’s tracked columns kept in the audit schema specifically because dbt’s CREATE OR REPLACE of main_gold.gold_customers never touches it. A golden_id present in the snapshot but absent from the rebuilt table is logged as logically_deleted (its sources were removed, or it merged into a different golden_id during re-matching).</w:t>
+      </w:r>
+    </w:p>
+    <w:p>
+      <w:pPr>
+        <w:spacing w:after="160"/>
+      </w:pPr>
+      <w:r>
+        <w:t xml:space="preserve">The read path — GET /api/v1/customers/{golden_id}/audit-trail — is gated by the same require_gold_read dependency as viewing the record itself (any read or read_write gold_access), so anyone who can see a golden record can see its full history. If the golden record has since been logically deleted, the endpoint reconstructs its last-known field values directly from the log rather than returning an empty result. There is no corresponding write or delete endpoint.</w:t>
+      </w:r>
+    </w:p>
+    <w:p>
+      <w:pPr>
+        <w:spacing w:after="160"/>
+      </w:pPr>
+      <w:r>
+        <w:rPr>
+          <w:i/>
+          <w:iCs/>
+          <w:color w:val="5B6770"/>
+        </w:rPr>
+        <w:t xml:space="preserve">Design note: this feature inherits the golden-ID-renumbering caveat already noted in Section 5 — if a reprocessing-created golden_id is later renumbered by a full dbt run, the audit trail logs the old number as logically_deleted and the new number as created, even though it is the same underlying customer. It also only captures a manual dbt run --select gold.* if audit_pipeline_diff.py is run immediately after — automatic inside build_pipeline.py, but not if the gold rebuild command is run by itself (e.g. after a Match Review decision).</w:t>
+      </w:r>
+    </w:p>
+    <w:p>
       <w:r>
         <w:br w:type="page"/>
       </w:r>
@@ -2975,6 +3033,19 @@
       </w:pPr>
       <w:r>
         <w:t xml:space="preserve">Administration → User Administration (admin role only) — create/edit/deactivate portal users, assign role and gold_access, and reset passwords. New-user creation returns a one-time password that is never stored or logged in plaintext (only its bcrypt hash persists).</w:t>
+      </w:r>
+    </w:p>
+    <w:p>
+      <w:pPr>
+        <w:pStyle w:val="ListParagraph"/>
+        <w:numPr>
+          <w:ilvl w:val="0"/>
+          <w:numId w:val="2"/>
+        </w:numPr>
+        <w:spacing w:after="90"/>
+      </w:pPr>
+      <w:r>
+        <w:t xml:space="preserve">Audit Trail — a read-only history panel, opened from a button on the customer detail modal, showing the golden record’s key identifiers plus a newest-first timeline of every creation, edit, and logical delete, each entry expandable to its field-level old/new diffs (Section 3.6).</w:t>
       </w:r>
     </w:p>
     <w:p>
@@ -4778,6 +4849,96 @@
               <w:bottom w:val="single" w:color="CCCCCC" w:sz="2"/>
               <w:right w:val="single" w:color="CCCCCC" w:sz="2"/>
             </w:tcBorders>
+            <w:tcMar>
+              <w:top w:type="dxa" w:w="80"/>
+              <w:left w:type="dxa" w:w="110"/>
+              <w:bottom w:type="dxa" w:w="80"/>
+              <w:right w:type="dxa" w:w="110"/>
+            </w:tcMar>
+            <w:vAlign w:val="center"/>
+          </w:tcPr>
+          <w:p>
+            <w:r>
+              <w:rPr>
+                <w:rFonts w:ascii="Consolas" w:cs="Consolas" w:eastAsia="Consolas" w:hAnsi="Consolas"/>
+                <w:b w:val="false"/>
+                <w:bCs w:val="false"/>
+                <w:sz w:val="18"/>
+                <w:szCs w:val="18"/>
+              </w:rPr>
+              <w:t xml:space="preserve">GET /customers/{golden_id}/audit-trail</w:t>
+            </w:r>
+          </w:p>
+        </w:tc>
+        <w:tc>
+          <w:tcPr>
+            <w:tcW w:type="dxa" w:w="4360"/>
+            <w:tcBorders>
+              <w:top w:val="single" w:color="CCCCCC" w:sz="2"/>
+              <w:left w:val="single" w:color="CCCCCC" w:sz="2"/>
+              <w:bottom w:val="single" w:color="CCCCCC" w:sz="2"/>
+              <w:right w:val="single" w:color="CCCCCC" w:sz="2"/>
+            </w:tcBorders>
+            <w:tcMar>
+              <w:top w:type="dxa" w:w="80"/>
+              <w:left w:type="dxa" w:w="110"/>
+              <w:bottom w:type="dxa" w:w="80"/>
+              <w:right w:type="dxa" w:w="110"/>
+            </w:tcMar>
+            <w:vAlign w:val="center"/>
+          </w:tcPr>
+          <w:p>
+            <w:r>
+              <w:rPr>
+                <w:b w:val="false"/>
+                <w:bCs w:val="false"/>
+                <w:sz w:val="18"/>
+                <w:szCs w:val="18"/>
+              </w:rPr>
+              <w:t xml:space="preserve">Read-only history: creation, edits, logical deletes</w:t>
+            </w:r>
+          </w:p>
+        </w:tc>
+        <w:tc>
+          <w:tcPr>
+            <w:tcW w:type="dxa" w:w="1400"/>
+            <w:tcBorders>
+              <w:top w:val="single" w:color="CCCCCC" w:sz="2"/>
+              <w:left w:val="single" w:color="CCCCCC" w:sz="2"/>
+              <w:bottom w:val="single" w:color="CCCCCC" w:sz="2"/>
+              <w:right w:val="single" w:color="CCCCCC" w:sz="2"/>
+            </w:tcBorders>
+            <w:tcMar>
+              <w:top w:type="dxa" w:w="80"/>
+              <w:left w:type="dxa" w:w="110"/>
+              <w:bottom w:type="dxa" w:w="80"/>
+              <w:right w:type="dxa" w:w="110"/>
+            </w:tcMar>
+            <w:vAlign w:val="center"/>
+          </w:tcPr>
+          <w:p>
+            <w:r>
+              <w:rPr>
+                <w:b w:val="false"/>
+                <w:bCs w:val="false"/>
+                <w:sz w:val="18"/>
+                <w:szCs w:val="18"/>
+              </w:rPr>
+              <w:t xml:space="preserve">read</w:t>
+            </w:r>
+          </w:p>
+        </w:tc>
+      </w:tr>
+      <w:tr>
+        <w:tc>
+          <w:tcPr>
+            <w:tcW w:type="dxa" w:w="3600"/>
+            <w:tcBorders>
+              <w:top w:val="single" w:color="CCCCCC" w:sz="2"/>
+              <w:left w:val="single" w:color="CCCCCC" w:sz="2"/>
+              <w:bottom w:val="single" w:color="CCCCCC" w:sz="2"/>
+              <w:right w:val="single" w:color="CCCCCC" w:sz="2"/>
+            </w:tcBorders>
             <w:shd w:fill="DCEAF0" w:val="clear"/>
             <w:tcMar>
               <w:top w:type="dxa" w:w="80"/>
@@ -6526,6 +6687,19 @@
       </w:pPr>
       <w:r>
         <w:t xml:space="preserve">New golden IDs from real-time reprocessing increment the current max, which can diverge from what a full dbt run would assign from scratch.</w:t>
+      </w:r>
+    </w:p>
+    <w:p>
+      <w:pPr>
+        <w:pStyle w:val="ListParagraph"/>
+        <w:numPr>
+          <w:ilvl w:val="0"/>
+          <w:numId w:val="2"/>
+        </w:numPr>
+        <w:spacing w:after="90"/>
+      </w:pPr>
+      <w:r>
+        <w:t xml:space="preserve">The audit trail (Section 3.6) inherits this golden-ID-renumbering behavior, and only captures a manual dbt run --select gold.* if audit_pipeline_diff.py is run immediately after — automatic inside build_pipeline.py, not if the gold rebuild is run by itself.</w:t>
       </w:r>
     </w:p>
     <w:p>

</xml_diff>

<commit_message>
Update Design_Document.docx for the Data Governance nav dropdown
- Section 4.2 Portal feature list: replaced the single Data Governance
  bullet with three bullets describing the new dropdown structure,
  the Data Stewardship item (role gate, window.open/focus launch
  behavior and its 'only recognizes tabs opened via this button'
  caveat), and the Lineage and Impact Analysis item (gold-access gate,
  unchanged backend endpoints).
- Fixed 'three areas' -> 'four areas' in the same paragraph -- stale
  since the Audit Trail button was added as a fourth top-level bullet
  in the previous update and this text was missed at the time.
</commit_message>
<xml_diff>
--- a/Design_Document.docx
+++ b/Design_Document.docx
@@ -2993,7 +2993,7 @@
         <w:spacing w:after="160"/>
       </w:pPr>
       <w:r>
-        <w:t xml:space="preserve">A login-gated application with three areas, gated by role and gold_access:</w:t>
+        <w:t xml:space="preserve">A login-gated application with four areas, gated by role and gold_access:</w:t>
       </w:r>
     </w:p>
     <w:p>
@@ -3019,7 +3019,33 @@
         <w:spacing w:after="90"/>
       </w:pPr>
       <w:r>
-        <w:t xml:space="preserve">Data Governance — a pannable, zoomable SVG network diagram of the entire lineage metadata graph (bronze → silver → gold → stewardship). Clicking any node highlights its upstream lineage in amber and downstream impact in green directly on the graph, with a side panel showing the node's description, direct incoming/outgoing rules, and upstream/downstream counts. Clicking a gold-layer node also surfaces a Golden ID lookup tool.</w:t>
+        <w:t xml:space="preserve">Data Governance -- a nav dropdown with two independently-gated items; the dropdown itself is hidden if neither item would be visible to the signed-in user.</w:t>
+      </w:r>
+    </w:p>
+    <w:p>
+      <w:pPr>
+        <w:pStyle w:val="ListParagraph"/>
+        <w:numPr>
+          <w:ilvl w:val="0"/>
+          <w:numId w:val="2"/>
+        </w:numPr>
+        <w:spacing w:after="90"/>
+      </w:pPr>
+      <w:r>
+        <w:t xml:space="preserve">Data Stewardship -- visible only to dataSteward/dataOwner accounts, the same role gate as the console itself (Section 4.1). Opens /app/ via window.open('/app/', 'mdmStewardshipTab'); clicking it again while that named browser tab is still open re-focuses the same tab instead of opening a duplicate, using the browser's native named-window targeting rather than any cross-tab messaging. This only recognizes tabs opened via this button -- a Stewardship tab opened by directly visiting /app/ is not detected as “already open.”</w:t>
+      </w:r>
+    </w:p>
+    <w:p>
+      <w:pPr>
+        <w:pStyle w:val="ListParagraph"/>
+        <w:numPr>
+          <w:ilvl w:val="0"/>
+          <w:numId w:val="2"/>
+        </w:numPr>
+        <w:spacing w:after="90"/>
+      </w:pPr>
+      <w:r>
+        <w:t xml:space="preserve">Lineage and Impact Analysis -- visible only to users with gold read or read_write access. This gates the portal nav item only; the underlying /api/v1/lineage/* endpoints remain open to any authenticated user regardless of gold_access, an intentional, pre-existing distinction (the lineage graph is pipeline metadata, not gold customer data). A pannable, zoomable SVG network diagram of the entire lineage metadata graph (bronze → silver → gold → stewardship). Clicking any node highlights its upstream lineage in amber and downstream impact in green directly on the graph, with a side panel showing the node's description, direct incoming/outgoing rules, and upstream/downstream counts. Clicking a gold-layer node also surfaces a Golden ID lookup tool.</w:t>
       </w:r>
     </w:p>
     <w:p>

</xml_diff>

<commit_message>
Add generic maker-checker approval workflow engine
Gates Data Stewardship remediation (1 Data Owner), Portal gold-record
edits (quorum of 2 Data Owners), Match Review confirm/reject (Data
Owner then Admin), and User Administration create/sensitive-update (a
different Admin) behind a shared workflow engine (api/workflow_engine.py,
governance schema) instead of applying immediately. Enforces no
self-approval and no double-deciding on one instance. Both apps get an
Approvals view over the new generic /api/v1/workflows/* endpoints.

Adds scripts/create_demo_governance_users.py to seed the extra Data
Owner/Admin accounts a fresh install needs to actually clear a quorum
or a different-approver requirement.

Updates README.md, PROJECT_KNOWLEDGE.md, Design_Document.docx,
Enterprise_Readiness_Assessment.docx, and both Installation_Guide
docx files to document the engine and its wiring.
</commit_message>
<xml_diff>
--- a/Design_Document.docx
+++ b/Design_Document.docx
@@ -253,6 +253,19 @@
       </w:pPr>
       <w:r>
         <w:t xml:space="preserve">The gold-layer audit trail: architecture, capture points, and access controls (Section 3.6).</w:t>
+      </w:r>
+    </w:p>
+    <w:p>
+      <w:pPr>
+        <w:pStyle w:val="ListParagraph"/>
+        <w:numPr>
+          <w:ilvl w:val="0"/>
+          <w:numId w:val="2"/>
+        </w:numPr>
+        <w:spacing w:after="90"/>
+      </w:pPr>
+      <w:r>
+        <w:t xml:space="preserve">The generic maker-checker approval workflow engine and its application to Data Stewardship, the Customer Data Portal, and User Administration (Section 4.4).</w:t>
       </w:r>
     </w:p>
     <w:p>
@@ -3091,6 +3104,90 @@
       </w:r>
     </w:p>
     <w:p>
+      <w:pPr>
+        <w:pStyle w:val="Heading2"/>
+      </w:pPr>
+      <w:r>
+        <w:t xml:space="preserve">4.4 Maker-Checker Approval Workflow Engine</w:t>
+      </w:r>
+    </w:p>
+    <w:p>
+      <w:pPr>
+        <w:spacing w:after="160"/>
+      </w:pPr>
+      <w:r>
+        <w:t xml:space="preserve">Several state-changing actions across the Stewardship Console, the Portal, and User Administration are routed through a generic, metadata-driven maker-checker workflow engine (api/workflow_engine.py) rather than applying immediately. A workflow_type is an ordered list of steps (governance.workflow_definitions), each naming a required role and how many distinct approvers of that role are needed to clear it (a single-level quorum, e.g. “2 different Data Owners,” or multiple sequential levels, e.g. “Data Owner, then Admin”). The engine enforces three rules independently of any caller: a maker can never approve or reject their own submission, the same approver can never cast two decisions on one instance, and rejection at any step is terminal — the change is never applied.</w:t>
+      </w:r>
+    </w:p>
+    <w:p>
+      <w:pPr>
+        <w:spacing w:after="160"/>
+      </w:pPr>
+      <w:r>
+        <w:t xml:space="preserve">Four workflows are configured today, each wired into the endpoint that used to apply its change directly:</w:t>
+      </w:r>
+    </w:p>
+    <w:p>
+      <w:pPr>
+        <w:pStyle w:val="ListParagraph"/>
+        <w:numPr>
+          <w:ilvl w:val="0"/>
+          <w:numId w:val="2"/>
+        </w:numPr>
+        <w:spacing w:after="90"/>
+      </w:pPr>
+      <w:r>
+        <w:t xml:space="preserve">Stewardship remediation — resolve or reject an exception queue record — 1 level, 1 Data Owner approver. A rejection returns the exception to the open queue.</w:t>
+      </w:r>
+    </w:p>
+    <w:p>
+      <w:pPr>
+        <w:pStyle w:val="ListParagraph"/>
+        <w:numPr>
+          <w:ilvl w:val="0"/>
+          <w:numId w:val="2"/>
+        </w:numPr>
+        <w:spacing w:after="90"/>
+      </w:pPr>
+      <w:r>
+        <w:t xml:space="preserve">Gold-record edit — an inline edit to a golden record from the Portal — 1 level, a quorum of 2 different Data Owners; nothing is written until both approve.</w:t>
+      </w:r>
+    </w:p>
+    <w:p>
+      <w:pPr>
+        <w:pStyle w:val="ListParagraph"/>
+        <w:numPr>
+          <w:ilvl w:val="0"/>
+          <w:numId w:val="2"/>
+        </w:numPr>
+        <w:spacing w:after="90"/>
+      </w:pPr>
+      <w:r>
+        <w:t xml:space="preserve">Match Review confirmation — confirm or reject a borderline fuzzy-match pair — 2 sequential levels, Data Owner then Admin.</w:t>
+      </w:r>
+    </w:p>
+    <w:p>
+      <w:pPr>
+        <w:pStyle w:val="ListParagraph"/>
+        <w:numPr>
+          <w:ilvl w:val="0"/>
+          <w:numId w:val="2"/>
+        </w:numPr>
+        <w:spacing w:after="90"/>
+      </w:pPr>
+      <w:r>
+        <w:t xml:space="preserve">User Administration change — create a user, or update role/gold_access/is_active on an existing one — 1 level, 1 Admin approver, who must be a different admin than whoever made the request. Full_name-only edits and password resets are not gated, since they don’t change what a user is authorized to do.</w:t>
+      </w:r>
+    </w:p>
+    <w:p>
+      <w:pPr>
+        <w:spacing w:after="160"/>
+      </w:pPr>
+      <w:r>
+        <w:t xml:space="preserve">Every authenticated user can see what is awaiting their decision and what they have submitted via GET /api/v1/workflows/pending and GET /api/v1/workflows/mine, and record a decision via POST /api/v1/workflows/{instance_id}/decide (Section 8). Both the Stewardship Console and the Portal expose an Approvals view over these same endpoints — the Portal's copy is visible to every role (not just dataSteward/dataOwner) since Admins, who approve Match Review's second level and User Administration changes, do not have access to the Stewardship Console.</w:t>
+      </w:r>
+    </w:p>
+    <w:p>
       <w:r>
         <w:br w:type="page"/>
       </w:r>
@@ -4740,7 +4837,7 @@
                 <w:sz w:val="18"/>
                 <w:szCs w:val="18"/>
               </w:rPr>
-              <w:t xml:space="preserve">Edit a golden record</w:t>
+              <w:t>Submit a golden-record edit (applies once a 2-Data-Owner quorum approves)</w:t>
             </w:r>
           </w:p>
         </w:tc>
@@ -5653,7 +5750,7 @@
                 <w:sz w:val="18"/>
                 <w:szCs w:val="18"/>
               </w:rPr>
-              <w:t xml:space="preserve">Approve a correction (triggers reprocessing)</w:t>
+              <w:t>Submit a correction for Data Owner approval (reprocesses once approved)</w:t>
             </w:r>
           </w:p>
         </w:tc>
@@ -5745,7 +5842,7 @@
                 <w:sz w:val="18"/>
                 <w:szCs w:val="18"/>
               </w:rPr>
-              <w:t xml:space="preserve">Reject a record</w:t>
+              <w:t>Submit a rejection for Data Owner approval</w:t>
             </w:r>
           </w:p>
         </w:tc>
@@ -6019,7 +6116,7 @@
                 <w:sz w:val="18"/>
                 <w:szCs w:val="18"/>
               </w:rPr>
-              <w:t xml:space="preserve">Confirm a pair is the same customer</w:t>
+              <w:t>Submit a confirm decision for approval (Data Owner, then Admin)</w:t>
             </w:r>
           </w:p>
         </w:tc>
@@ -6111,7 +6208,7 @@
                 <w:sz w:val="18"/>
                 <w:szCs w:val="18"/>
               </w:rPr>
-              <w:t xml:space="preserve">Reject a pair as coincidental</w:t>
+              <w:t>Submit a reject decision for approval (Data Owner, then Admin)</w:t>
             </w:r>
           </w:p>
         </w:tc>
@@ -6294,7 +6391,7 @@
                 <w:sz w:val="18"/>
                 <w:szCs w:val="18"/>
               </w:rPr>
-              <w:t xml:space="preserve">Create a user</w:t>
+              <w:t>Submit a new-user request for a different Admin's approval</w:t>
             </w:r>
           </w:p>
         </w:tc>
@@ -6385,7 +6482,7 @@
                 <w:sz w:val="18"/>
                 <w:szCs w:val="18"/>
               </w:rPr>
-              <w:t xml:space="preserve">Update role/access/status</w:t>
+              <w:t>Update full_name immediately; role/gold_access/is_active changes submit for a different Admin's approval</w:t>
             </w:r>
           </w:p>
         </w:tc>
@@ -6508,6 +6605,366 @@
                 <w:szCs w:val="18"/>
               </w:rPr>
               <w:t xml:space="preserve">Admin</w:t>
+            </w:r>
+          </w:p>
+        </w:tc>
+      </w:tr>
+      <w:tr>
+        <w:tc>
+          <w:tcPr>
+            <w:tcW w:type="dxa" w:w="3600"/>
+            <w:tcBorders>
+              <w:top w:val="single" w:color="CCCCCC" w:sz="2"/>
+              <w:left w:val="single" w:color="CCCCCC" w:sz="2"/>
+              <w:bottom w:val="single" w:color="CCCCCC" w:sz="2"/>
+              <w:right w:val="single" w:color="CCCCCC" w:sz="2"/>
+            </w:tcBorders>
+            <w:tcMar>
+              <w:top w:type="dxa" w:w="80"/>
+              <w:left w:type="dxa" w:w="110"/>
+              <w:bottom w:type="dxa" w:w="80"/>
+              <w:right w:type="dxa" w:w="110"/>
+            </w:tcMar>
+            <w:vAlign w:val="center"/>
+          </w:tcPr>
+          <w:p>
+            <w:r>
+              <w:rPr>
+                <w:rFonts w:ascii="Consolas" w:cs="Consolas" w:eastAsia="Consolas" w:hAnsi="Consolas"/>
+                <w:b w:val="false"/>
+                <w:bCs w:val="false"/>
+                <w:sz w:val="18"/>
+                <w:szCs w:val="18"/>
+              </w:rPr>
+              <w:t>GET /workflows/pending</w:t>
+            </w:r>
+          </w:p>
+        </w:tc>
+        <w:tc>
+          <w:tcPr>
+            <w:tcW w:type="dxa" w:w="4360"/>
+            <w:tcBorders>
+              <w:top w:val="single" w:color="CCCCCC" w:sz="2"/>
+              <w:left w:val="single" w:color="CCCCCC" w:sz="2"/>
+              <w:bottom w:val="single" w:color="CCCCCC" w:sz="2"/>
+              <w:right w:val="single" w:color="CCCCCC" w:sz="2"/>
+            </w:tcBorders>
+            <w:tcMar>
+              <w:top w:type="dxa" w:w="80"/>
+              <w:left w:type="dxa" w:w="110"/>
+              <w:bottom w:type="dxa" w:w="80"/>
+              <w:right w:type="dxa" w:w="110"/>
+            </w:tcMar>
+            <w:vAlign w:val="center"/>
+          </w:tcPr>
+          <w:p>
+            <w:r>
+              <w:rPr>
+                <w:b w:val="false"/>
+                <w:bCs w:val="false"/>
+                <w:sz w:val="18"/>
+                <w:szCs w:val="18"/>
+              </w:rPr>
+              <w:t>Instances awaiting the caller's decision</w:t>
+            </w:r>
+          </w:p>
+        </w:tc>
+        <w:tc>
+          <w:tcPr>
+            <w:tcW w:type="dxa" w:w="1400"/>
+            <w:tcBorders>
+              <w:top w:val="single" w:color="CCCCCC" w:sz="2"/>
+              <w:left w:val="single" w:color="CCCCCC" w:sz="2"/>
+              <w:bottom w:val="single" w:color="CCCCCC" w:sz="2"/>
+              <w:right w:val="single" w:color="CCCCCC" w:sz="2"/>
+            </w:tcBorders>
+            <w:tcMar>
+              <w:top w:type="dxa" w:w="80"/>
+              <w:left w:type="dxa" w:w="110"/>
+              <w:bottom w:type="dxa" w:w="80"/>
+              <w:right w:type="dxa" w:w="110"/>
+            </w:tcMar>
+            <w:vAlign w:val="center"/>
+          </w:tcPr>
+          <w:p>
+            <w:r>
+              <w:rPr>
+                <w:b w:val="false"/>
+                <w:bCs w:val="false"/>
+                <w:sz w:val="18"/>
+                <w:szCs w:val="18"/>
+              </w:rPr>
+              <w:t>Bearer</w:t>
+            </w:r>
+          </w:p>
+        </w:tc>
+      </w:tr>
+      <w:tr>
+        <w:tc>
+          <w:tcPr>
+            <w:tcW w:type="dxa" w:w="3600"/>
+            <w:tcBorders>
+              <w:top w:val="single" w:color="CCCCCC" w:sz="2"/>
+              <w:left w:val="single" w:color="CCCCCC" w:sz="2"/>
+              <w:bottom w:val="single" w:color="CCCCCC" w:sz="2"/>
+              <w:right w:val="single" w:color="CCCCCC" w:sz="2"/>
+            </w:tcBorders>
+            <w:tcMar>
+              <w:top w:type="dxa" w:w="80"/>
+              <w:left w:type="dxa" w:w="110"/>
+              <w:bottom w:type="dxa" w:w="80"/>
+              <w:right w:type="dxa" w:w="110"/>
+            </w:tcMar>
+            <w:vAlign w:val="center"/>
+          </w:tcPr>
+          <w:p>
+            <w:r>
+              <w:rPr>
+                <w:rFonts w:ascii="Consolas" w:cs="Consolas" w:eastAsia="Consolas" w:hAnsi="Consolas"/>
+                <w:b w:val="false"/>
+                <w:bCs w:val="false"/>
+                <w:sz w:val="18"/>
+                <w:szCs w:val="18"/>
+              </w:rPr>
+              <w:t>GET /workflows/mine</w:t>
+            </w:r>
+          </w:p>
+        </w:tc>
+        <w:tc>
+          <w:tcPr>
+            <w:tcW w:type="dxa" w:w="4360"/>
+            <w:tcBorders>
+              <w:top w:val="single" w:color="CCCCCC" w:sz="2"/>
+              <w:left w:val="single" w:color="CCCCCC" w:sz="2"/>
+              <w:bottom w:val="single" w:color="CCCCCC" w:sz="2"/>
+              <w:right w:val="single" w:color="CCCCCC" w:sz="2"/>
+            </w:tcBorders>
+            <w:tcMar>
+              <w:top w:type="dxa" w:w="80"/>
+              <w:left w:type="dxa" w:w="110"/>
+              <w:bottom w:type="dxa" w:w="80"/>
+              <w:right w:type="dxa" w:w="110"/>
+            </w:tcMar>
+            <w:vAlign w:val="center"/>
+          </w:tcPr>
+          <w:p>
+            <w:r>
+              <w:rPr>
+                <w:b w:val="false"/>
+                <w:bCs w:val="false"/>
+                <w:sz w:val="18"/>
+                <w:szCs w:val="18"/>
+              </w:rPr>
+              <w:t>Instances the caller submitted, with status</w:t>
+            </w:r>
+          </w:p>
+        </w:tc>
+        <w:tc>
+          <w:tcPr>
+            <w:tcW w:type="dxa" w:w="1400"/>
+            <w:tcBorders>
+              <w:top w:val="single" w:color="CCCCCC" w:sz="2"/>
+              <w:left w:val="single" w:color="CCCCCC" w:sz="2"/>
+              <w:bottom w:val="single" w:color="CCCCCC" w:sz="2"/>
+              <w:right w:val="single" w:color="CCCCCC" w:sz="2"/>
+            </w:tcBorders>
+            <w:tcMar>
+              <w:top w:type="dxa" w:w="80"/>
+              <w:left w:type="dxa" w:w="110"/>
+              <w:bottom w:type="dxa" w:w="80"/>
+              <w:right w:type="dxa" w:w="110"/>
+            </w:tcMar>
+            <w:vAlign w:val="center"/>
+          </w:tcPr>
+          <w:p>
+            <w:r>
+              <w:rPr>
+                <w:b w:val="false"/>
+                <w:bCs w:val="false"/>
+                <w:sz w:val="18"/>
+                <w:szCs w:val="18"/>
+              </w:rPr>
+              <w:t>Bearer</w:t>
+            </w:r>
+          </w:p>
+        </w:tc>
+      </w:tr>
+      <w:tr>
+        <w:tc>
+          <w:tcPr>
+            <w:tcW w:type="dxa" w:w="3600"/>
+            <w:tcBorders>
+              <w:top w:val="single" w:color="CCCCCC" w:sz="2"/>
+              <w:left w:val="single" w:color="CCCCCC" w:sz="2"/>
+              <w:bottom w:val="single" w:color="CCCCCC" w:sz="2"/>
+              <w:right w:val="single" w:color="CCCCCC" w:sz="2"/>
+            </w:tcBorders>
+            <w:tcMar>
+              <w:top w:type="dxa" w:w="80"/>
+              <w:left w:type="dxa" w:w="110"/>
+              <w:bottom w:type="dxa" w:w="80"/>
+              <w:right w:type="dxa" w:w="110"/>
+            </w:tcMar>
+            <w:vAlign w:val="center"/>
+          </w:tcPr>
+          <w:p>
+            <w:r>
+              <w:rPr>
+                <w:rFonts w:ascii="Consolas" w:cs="Consolas" w:eastAsia="Consolas" w:hAnsi="Consolas"/>
+                <w:b w:val="false"/>
+                <w:bCs w:val="false"/>
+                <w:sz w:val="18"/>
+                <w:szCs w:val="18"/>
+              </w:rPr>
+              <w:t>GET /workflows/{instance_id}</w:t>
+            </w:r>
+          </w:p>
+        </w:tc>
+        <w:tc>
+          <w:tcPr>
+            <w:tcW w:type="dxa" w:w="4360"/>
+            <w:tcBorders>
+              <w:top w:val="single" w:color="CCCCCC" w:sz="2"/>
+              <w:left w:val="single" w:color="CCCCCC" w:sz="2"/>
+              <w:bottom w:val="single" w:color="CCCCCC" w:sz="2"/>
+              <w:right w:val="single" w:color="CCCCCC" w:sz="2"/>
+            </w:tcBorders>
+            <w:tcMar>
+              <w:top w:type="dxa" w:w="80"/>
+              <w:left w:type="dxa" w:w="110"/>
+              <w:bottom w:type="dxa" w:w="80"/>
+              <w:right w:type="dxa" w:w="110"/>
+            </w:tcMar>
+            <w:vAlign w:val="center"/>
+          </w:tcPr>
+          <w:p>
+            <w:r>
+              <w:rPr>
+                <w:b w:val="false"/>
+                <w:bCs w:val="false"/>
+                <w:sz w:val="18"/>
+                <w:szCs w:val="18"/>
+              </w:rPr>
+              <w:t>One workflow instance, full detail incl. decisions</w:t>
+            </w:r>
+          </w:p>
+        </w:tc>
+        <w:tc>
+          <w:tcPr>
+            <w:tcW w:type="dxa" w:w="1400"/>
+            <w:tcBorders>
+              <w:top w:val="single" w:color="CCCCCC" w:sz="2"/>
+              <w:left w:val="single" w:color="CCCCCC" w:sz="2"/>
+              <w:bottom w:val="single" w:color="CCCCCC" w:sz="2"/>
+              <w:right w:val="single" w:color="CCCCCC" w:sz="2"/>
+            </w:tcBorders>
+            <w:tcMar>
+              <w:top w:type="dxa" w:w="80"/>
+              <w:left w:type="dxa" w:w="110"/>
+              <w:bottom w:type="dxa" w:w="80"/>
+              <w:right w:type="dxa" w:w="110"/>
+            </w:tcMar>
+            <w:vAlign w:val="center"/>
+          </w:tcPr>
+          <w:p>
+            <w:r>
+              <w:rPr>
+                <w:b w:val="false"/>
+                <w:bCs w:val="false"/>
+                <w:sz w:val="18"/>
+                <w:szCs w:val="18"/>
+              </w:rPr>
+              <w:t>Bearer</w:t>
+            </w:r>
+          </w:p>
+        </w:tc>
+      </w:tr>
+      <w:tr>
+        <w:tc>
+          <w:tcPr>
+            <w:tcW w:type="dxa" w:w="3600"/>
+            <w:tcBorders>
+              <w:top w:val="single" w:color="CCCCCC" w:sz="2"/>
+              <w:left w:val="single" w:color="CCCCCC" w:sz="2"/>
+              <w:bottom w:val="single" w:color="CCCCCC" w:sz="2"/>
+              <w:right w:val="single" w:color="CCCCCC" w:sz="2"/>
+            </w:tcBorders>
+            <w:tcMar>
+              <w:top w:type="dxa" w:w="80"/>
+              <w:left w:type="dxa" w:w="110"/>
+              <w:bottom w:type="dxa" w:w="80"/>
+              <w:right w:type="dxa" w:w="110"/>
+            </w:tcMar>
+            <w:vAlign w:val="center"/>
+          </w:tcPr>
+          <w:p>
+            <w:r>
+              <w:rPr>
+                <w:rFonts w:ascii="Consolas" w:cs="Consolas" w:eastAsia="Consolas" w:hAnsi="Consolas"/>
+                <w:b w:val="false"/>
+                <w:bCs w:val="false"/>
+                <w:sz w:val="18"/>
+                <w:szCs w:val="18"/>
+              </w:rPr>
+              <w:t>POST /workflows/{instance_id}/decide</w:t>
+            </w:r>
+          </w:p>
+        </w:tc>
+        <w:tc>
+          <w:tcPr>
+            <w:tcW w:type="dxa" w:w="4360"/>
+            <w:tcBorders>
+              <w:top w:val="single" w:color="CCCCCC" w:sz="2"/>
+              <w:left w:val="single" w:color="CCCCCC" w:sz="2"/>
+              <w:bottom w:val="single" w:color="CCCCCC" w:sz="2"/>
+              <w:right w:val="single" w:color="CCCCCC" w:sz="2"/>
+            </w:tcBorders>
+            <w:tcMar>
+              <w:top w:type="dxa" w:w="80"/>
+              <w:left w:type="dxa" w:w="110"/>
+              <w:bottom w:type="dxa" w:w="80"/>
+              <w:right w:type="dxa" w:w="110"/>
+            </w:tcMar>
+            <w:vAlign w:val="center"/>
+          </w:tcPr>
+          <w:p>
+            <w:r>
+              <w:rPr>
+                <w:b w:val="false"/>
+                <w:bCs w:val="false"/>
+                <w:sz w:val="18"/>
+                <w:szCs w:val="18"/>
+              </w:rPr>
+              <w:t>Approve or reject the current step (body: decision, comment)</w:t>
+            </w:r>
+          </w:p>
+        </w:tc>
+        <w:tc>
+          <w:tcPr>
+            <w:tcW w:type="dxa" w:w="1400"/>
+            <w:tcBorders>
+              <w:top w:val="single" w:color="CCCCCC" w:sz="2"/>
+              <w:left w:val="single" w:color="CCCCCC" w:sz="2"/>
+              <w:bottom w:val="single" w:color="CCCCCC" w:sz="2"/>
+              <w:right w:val="single" w:color="CCCCCC" w:sz="2"/>
+            </w:tcBorders>
+            <w:tcMar>
+              <w:top w:type="dxa" w:w="80"/>
+              <w:left w:type="dxa" w:w="110"/>
+              <w:bottom w:type="dxa" w:w="80"/>
+              <w:right w:type="dxa" w:w="110"/>
+            </w:tcMar>
+            <w:vAlign w:val="center"/>
+          </w:tcPr>
+          <w:p>
+            <w:r>
+              <w:rPr>
+                <w:b w:val="false"/>
+                <w:bCs w:val="false"/>
+                <w:sz w:val="18"/>
+                <w:szCs w:val="18"/>
+              </w:rPr>
+              <w:t>Bearer</w:t>
             </w:r>
           </w:p>
         </w:tc>
@@ -6765,6 +7222,45 @@
       </w:pPr>
       <w:r>
         <w:t xml:space="preserve">Auth is sized for a demo: no MFA, no refresh tokens, single local DuckDB file.</w:t>
+      </w:r>
+    </w:p>
+    <w:p>
+      <w:pPr>
+        <w:pStyle w:val="ListParagraph"/>
+        <w:numPr>
+          <w:ilvl w:val="0"/>
+          <w:numId w:val="2"/>
+        </w:numPr>
+        <w:spacing w:after="90"/>
+      </w:pPr>
+      <w:r>
+        <w:t xml:space="preserve">The maker-checker workflow engine (Section 4.4) only gates the four workflows listed there; Reference Data Maintenance and Rules Configuration (planned Data Governance screens, not yet built) are not covered by it yet.</w:t>
+      </w:r>
+    </w:p>
+    <w:p>
+      <w:pPr>
+        <w:pStyle w:val="ListParagraph"/>
+        <w:numPr>
+          <w:ilvl w:val="0"/>
+          <w:numId w:val="2"/>
+        </w:numPr>
+        <w:spacing w:after="90"/>
+      </w:pPr>
+      <w:r>
+        <w:t xml:space="preserve">If the domain action itself fails after every required approval has already been recorded (e.g. a downstream write error), the workflow instance is still marked approved — the human decision stands — and the failure is captured in its result field rather than silently rolled back; there is no automatic retry.</w:t>
+      </w:r>
+    </w:p>
+    <w:p>
+      <w:pPr>
+        <w:pStyle w:val="ListParagraph"/>
+        <w:numPr>
+          <w:ilvl w:val="0"/>
+          <w:numId w:val="2"/>
+        </w:numPr>
+        <w:spacing w:after="90"/>
+      </w:pPr>
+      <w:r>
+        <w:t xml:space="preserve">A quorum or multi-level chain needs enough distinct people in the required role to ever clear, since a maker cannot approve their own submission and the same approver cannot decide twice on one instance; this demo ships one account per role by default and a helper script (scripts/create_demo_governance_users.py) to seed the extra Data Owner and Admin accounts needed to actually exercise a quorum or a two-person sign-off end to end.</w:t>
       </w:r>
     </w:p>
     <w:p>

</xml_diff>